<commit_message>
Phase 1 new updates
</commit_message>
<xml_diff>
--- a/docs/F1 Strategy SQL Pipeline.docx
+++ b/docs/F1 Strategy SQL Pipeline.docx
@@ -6989,17 +6989,40 @@
         <w:t>print(</w:t>
       </w:r>
       <w:proofErr w:type="spellStart"/>
-      <w:proofErr w:type="gramStart"/>
       <w:r>
         <w:t>df.head</w:t>
       </w:r>
       <w:proofErr w:type="spellEnd"/>
-      <w:proofErr w:type="gramEnd"/>
       <w:r>
         <w:t>())</w:t>
       </w:r>
     </w:p>
     <w:p/>
+    <w:p>
+      <w:r>
+        <w:t>Creating a stored procedure</w:t>
+      </w:r>
+    </w:p>
+    <w:p/>
+    <w:p/>
+    <w:p>
+      <w:r>
+        <w:t>The stored procedure can be run when the dataset needs to be generated/re-generated.</w:t>
+      </w:r>
+    </w:p>
+    <w:p>
+      <w:r>
+        <w:t xml:space="preserve">EXEC </w:t>
+      </w:r>
+      <w:proofErr w:type="spellStart"/>
+      <w:r>
+        <w:t>sp_build_podium_prediction_dataset</w:t>
+      </w:r>
+      <w:proofErr w:type="spellEnd"/>
+      <w:r>
+        <w:t>;</w:t>
+      </w:r>
+    </w:p>
     <w:sectPr>
       <w:pgSz w:w="12240" w:h="15840"/>
       <w:pgMar w:top="1440" w:right="1440" w:bottom="1440" w:left="1440" w:header="720" w:footer="720" w:gutter="0"/>

</xml_diff>